<commit_message>
Continue the smol THM CTF
</commit_message>
<xml_diff>
--- a/THM_challenges/Medium/Smol/Smol_Solution_Documentation.docx
+++ b/THM_challenges/Medium/Smol/Smol_Solution_Documentation.docx
@@ -13,7 +13,6 @@
           <w:u w:val="single"/>
         </w:rPr>
       </w:pPr>
-      <w:proofErr w:type="spellStart"/>
       <w:r>
         <w:rPr>
           <w:b/>
@@ -22,18 +21,7 @@
           <w:szCs w:val="32"/>
           <w:u w:val="single"/>
         </w:rPr>
-        <w:t>Smol</w:t>
-      </w:r>
-      <w:proofErr w:type="spellEnd"/>
-      <w:r>
-        <w:rPr>
-          <w:b/>
-          <w:bCs/>
-          <w:sz w:val="32"/>
-          <w:szCs w:val="32"/>
-          <w:u w:val="single"/>
-        </w:rPr>
-        <w:t xml:space="preserve"> Solution Documentation</w:t>
+        <w:t>Smol Solution Documentation</w:t>
       </w:r>
     </w:p>
     <w:p>
@@ -71,6 +59,9 @@
     </w:p>
     <w:p>
       <w:r>
+        <w:rPr>
+          <w:noProof/>
+        </w:rPr>
         <w:drawing>
           <wp:inline distT="0" distB="0" distL="0" distR="0" wp14:anchorId="0C50CA40" wp14:editId="126BA65C">
             <wp:extent cx="5239204" cy="2141406"/>
@@ -127,15 +118,7 @@
         <w:t xml:space="preserve">In addition, I found the </w:t>
       </w:r>
       <w:r>
-        <w:t>domain of the target “</w:t>
-      </w:r>
-      <w:proofErr w:type="spellStart"/>
-      <w:r>
-        <w:t>smol.thm</w:t>
-      </w:r>
-      <w:proofErr w:type="spellEnd"/>
-      <w:r>
-        <w:t>”</w:t>
+        <w:t>domain of the target “smol.thm”</w:t>
       </w:r>
       <w:r>
         <w:t xml:space="preserve"> from the description </w:t>
@@ -161,6 +144,9 @@
     </w:p>
     <w:p>
       <w:r>
+        <w:rPr>
+          <w:noProof/>
+        </w:rPr>
         <w:drawing>
           <wp:inline distT="0" distB="0" distL="0" distR="0" wp14:anchorId="6F954F46" wp14:editId="4E0F1D73">
             <wp:extent cx="3036833" cy="998307"/>
@@ -200,11 +186,127 @@
     </w:p>
     <w:p>
       <w:r>
-        <w:t>Then, I accessed the website:</w:t>
-      </w:r>
-    </w:p>
-    <w:p>
-      <w:r>
+        <w:t xml:space="preserve">Before </w:t>
+      </w:r>
+      <w:r>
+        <w:t>starting</w:t>
+      </w:r>
+      <w:r>
+        <w:t xml:space="preserve"> exploring the website, I run a </w:t>
+      </w:r>
+      <w:r>
+        <w:t xml:space="preserve">Gobuster directory enumeration </w:t>
+      </w:r>
+      <w:r>
+        <w:t>scan to detect useful pages</w:t>
+      </w:r>
+      <w:r>
+        <w:t>:</w:t>
+      </w:r>
+    </w:p>
+    <w:p>
+      <w:r>
+        <w:drawing>
+          <wp:inline distT="0" distB="0" distL="0" distR="0" wp14:anchorId="55998901" wp14:editId="710298F8">
+            <wp:extent cx="4839119" cy="3238781"/>
+            <wp:effectExtent l="0" t="0" r="0" b="0"/>
+            <wp:docPr id="704006897" name="תמונה 1" descr="תמונה שמכילה טקסט, צילום מסך, תוכנה, תכונות מולטימדיה&#10;&#10;תוכן בינה מלאכותית גנרטיבית עשוי להיות שגוי."/>
+            <wp:cNvGraphicFramePr>
+              <a:graphicFrameLocks xmlns:a="http://schemas.openxmlformats.org/drawingml/2006/main" noChangeAspect="1"/>
+            </wp:cNvGraphicFramePr>
+            <a:graphic xmlns:a="http://schemas.openxmlformats.org/drawingml/2006/main">
+              <a:graphicData uri="http://schemas.openxmlformats.org/drawingml/2006/picture">
+                <pic:pic xmlns:pic="http://schemas.openxmlformats.org/drawingml/2006/picture">
+                  <pic:nvPicPr>
+                    <pic:cNvPr id="704006897" name="תמונה 1" descr="תמונה שמכילה טקסט, צילום מסך, תוכנה, תכונות מולטימדיה&#10;&#10;תוכן בינה מלאכותית גנרטיבית עשוי להיות שגוי."/>
+                    <pic:cNvPicPr/>
+                  </pic:nvPicPr>
+                  <pic:blipFill>
+                    <a:blip r:embed="rId6"/>
+                    <a:stretch>
+                      <a:fillRect/>
+                    </a:stretch>
+                  </pic:blipFill>
+                  <pic:spPr>
+                    <a:xfrm>
+                      <a:off x="0" y="0"/>
+                      <a:ext cx="4839119" cy="3238781"/>
+                    </a:xfrm>
+                    <a:prstGeom prst="rect">
+                      <a:avLst/>
+                    </a:prstGeom>
+                  </pic:spPr>
+                </pic:pic>
+              </a:graphicData>
+            </a:graphic>
+          </wp:inline>
+        </w:drawing>
+      </w:r>
+    </w:p>
+    <w:p>
+      <w:r>
+        <w:t xml:space="preserve">I found wp-content </w:t>
+      </w:r>
+      <w:r>
+        <w:t>director</w:t>
+      </w:r>
+      <w:r>
+        <w:t>y</w:t>
+      </w:r>
+      <w:r>
+        <w:t>:</w:t>
+      </w:r>
+    </w:p>
+    <w:p>
+      <w:r>
+        <w:lastRenderedPageBreak/>
+        <w:drawing>
+          <wp:inline distT="0" distB="0" distL="0" distR="0" wp14:anchorId="3BA22934" wp14:editId="57139591">
+            <wp:extent cx="5334462" cy="5132515"/>
+            <wp:effectExtent l="0" t="0" r="0" b="0"/>
+            <wp:docPr id="1203894793" name="תמונה 1"/>
+            <wp:cNvGraphicFramePr>
+              <a:graphicFrameLocks xmlns:a="http://schemas.openxmlformats.org/drawingml/2006/main" noChangeAspect="1"/>
+            </wp:cNvGraphicFramePr>
+            <a:graphic xmlns:a="http://schemas.openxmlformats.org/drawingml/2006/main">
+              <a:graphicData uri="http://schemas.openxmlformats.org/drawingml/2006/picture">
+                <pic:pic xmlns:pic="http://schemas.openxmlformats.org/drawingml/2006/picture">
+                  <pic:nvPicPr>
+                    <pic:cNvPr id="1203894793" name=""/>
+                    <pic:cNvPicPr/>
+                  </pic:nvPicPr>
+                  <pic:blipFill>
+                    <a:blip r:embed="rId7"/>
+                    <a:stretch>
+                      <a:fillRect/>
+                    </a:stretch>
+                  </pic:blipFill>
+                  <pic:spPr>
+                    <a:xfrm>
+                      <a:off x="0" y="0"/>
+                      <a:ext cx="5334462" cy="5132515"/>
+                    </a:xfrm>
+                    <a:prstGeom prst="rect">
+                      <a:avLst/>
+                    </a:prstGeom>
+                  </pic:spPr>
+                </pic:pic>
+              </a:graphicData>
+            </a:graphic>
+          </wp:inline>
+        </w:drawing>
+      </w:r>
+    </w:p>
+    <w:p>
+      <w:r>
+        <w:t>Here I found nothing unusual, so moved to the website:</w:t>
+      </w:r>
+    </w:p>
+    <w:p>
+      <w:r>
+        <w:rPr>
+          <w:noProof/>
+        </w:rPr>
         <w:lastRenderedPageBreak/>
         <w:drawing>
           <wp:inline distT="0" distB="0" distL="0" distR="0" wp14:anchorId="48C75D99" wp14:editId="55A32D43">
@@ -222,7 +324,7 @@
                     <pic:cNvPicPr/>
                   </pic:nvPicPr>
                   <pic:blipFill>
-                    <a:blip r:embed="rId6"/>
+                    <a:blip r:embed="rId8"/>
                     <a:stretch>
                       <a:fillRect/>
                     </a:stretch>
@@ -283,6 +385,9 @@
     </w:p>
     <w:p>
       <w:r>
+        <w:rPr>
+          <w:noProof/>
+        </w:rPr>
         <w:lastRenderedPageBreak/>
         <w:drawing>
           <wp:inline distT="0" distB="0" distL="0" distR="0" wp14:anchorId="27B583BA" wp14:editId="798B422C">
@@ -300,7 +405,7 @@
                     <pic:cNvPicPr/>
                   </pic:nvPicPr>
                   <pic:blipFill>
-                    <a:blip r:embed="rId7"/>
+                    <a:blip r:embed="rId9"/>
                     <a:stretch>
                       <a:fillRect/>
                     </a:stretch>
@@ -501,6 +606,9 @@
     </w:p>
     <w:p>
       <w:r>
+        <w:rPr>
+          <w:noProof/>
+        </w:rPr>
         <w:lastRenderedPageBreak/>
         <w:drawing>
           <wp:inline distT="0" distB="0" distL="0" distR="0" wp14:anchorId="3322E7A9" wp14:editId="4F9EB157">
@@ -518,7 +626,7 @@
                     <pic:cNvPicPr/>
                   </pic:nvPicPr>
                   <pic:blipFill>
-                    <a:blip r:embed="rId8"/>
+                    <a:blip r:embed="rId10"/>
                     <a:stretch>
                       <a:fillRect/>
                     </a:stretch>
@@ -555,6 +663,9 @@
     </w:p>
     <w:p>
       <w:r>
+        <w:rPr>
+          <w:noProof/>
+        </w:rPr>
         <w:drawing>
           <wp:inline distT="0" distB="0" distL="0" distR="0" wp14:anchorId="478EAE81" wp14:editId="7792F9C7">
             <wp:extent cx="7556500" cy="3510280"/>
@@ -571,7 +682,7 @@
                     <pic:cNvPicPr/>
                   </pic:nvPicPr>
                   <pic:blipFill>
-                    <a:blip r:embed="rId9"/>
+                    <a:blip r:embed="rId11"/>
                     <a:stretch>
                       <a:fillRect/>
                     </a:stretch>
@@ -605,38 +716,38 @@
       <w:r>
         <w:t xml:space="preserve"> login page.</w:t>
       </w:r>
-      <w:r>
-        <w:t xml:space="preserve"> </w:t>
-      </w:r>
-      <w:r>
-        <w:t xml:space="preserve">I tried to enter fake credentials </w:t>
-      </w:r>
-      <w:r>
-        <w:t>“test”, “test”</w:t>
-      </w:r>
-      <w:r>
-        <w:t xml:space="preserve"> to </w:t>
-      </w:r>
-      <w:r>
-        <w:t>examine</w:t>
-      </w:r>
-      <w:r>
-        <w:t xml:space="preserve"> </w:t>
-      </w:r>
-      <w:r>
-        <w:t>the login reaction</w:t>
-      </w:r>
-      <w:r>
-        <w:t xml:space="preserve"> and I got this error message:</w:t>
-      </w:r>
-    </w:p>
-    <w:p>
-      <w:r>
+    </w:p>
+    <w:p>
+      <w:r>
+        <w:t>Thereafter</w:t>
+      </w:r>
+      <w:r>
+        <w:t xml:space="preserve">, I </w:t>
+      </w:r>
+      <w:r>
+        <w:t xml:space="preserve">used wpscan tool </w:t>
+      </w:r>
+      <w:r>
+        <w:t xml:space="preserve">to find users and vulnerabilities over this </w:t>
+      </w:r>
+      <w:r>
+        <w:t>WordPress</w:t>
+      </w:r>
+      <w:r>
+        <w:t xml:space="preserve"> website</w:t>
+      </w:r>
+      <w:r>
+        <w:t>:</w:t>
+      </w:r>
+    </w:p>
+    <w:p>
+      <w:r>
+        <w:lastRenderedPageBreak/>
         <w:drawing>
-          <wp:inline distT="0" distB="0" distL="0" distR="0" wp14:anchorId="76DA85D2" wp14:editId="384CCE5D">
-            <wp:extent cx="2236664" cy="598222"/>
+          <wp:inline distT="0" distB="0" distL="0" distR="0" wp14:anchorId="2B66EA9D" wp14:editId="02FD1BDC">
+            <wp:extent cx="3734124" cy="1371719"/>
             <wp:effectExtent l="0" t="0" r="0" b="0"/>
-            <wp:docPr id="371473248" name="תמונה 1"/>
+            <wp:docPr id="1479476467" name="תמונה 1" descr="תמונה שמכילה טקסט, גופן, צילום מסך, מספר&#10;&#10;תוכן בינה מלאכותית גנרטיבית עשוי להיות שגוי."/>
             <wp:cNvGraphicFramePr>
               <a:graphicFrameLocks xmlns:a="http://schemas.openxmlformats.org/drawingml/2006/main" noChangeAspect="1"/>
             </wp:cNvGraphicFramePr>
@@ -644,11 +755,11 @@
               <a:graphicData uri="http://schemas.openxmlformats.org/drawingml/2006/picture">
                 <pic:pic xmlns:pic="http://schemas.openxmlformats.org/drawingml/2006/picture">
                   <pic:nvPicPr>
-                    <pic:cNvPr id="371473248" name=""/>
+                    <pic:cNvPr id="1479476467" name="תמונה 1" descr="תמונה שמכילה טקסט, גופן, צילום מסך, מספר&#10;&#10;תוכן בינה מלאכותית גנרטיבית עשוי להיות שגוי."/>
                     <pic:cNvPicPr/>
                   </pic:nvPicPr>
                   <pic:blipFill>
-                    <a:blip r:embed="rId10"/>
+                    <a:blip r:embed="rId12"/>
                     <a:stretch>
                       <a:fillRect/>
                     </a:stretch>
@@ -656,7 +767,7 @@
                   <pic:spPr>
                     <a:xfrm>
                       <a:off x="0" y="0"/>
-                      <a:ext cx="2236664" cy="598222"/>
+                      <a:ext cx="3734124" cy="1371719"/>
                     </a:xfrm>
                     <a:prstGeom prst="rect">
                       <a:avLst/>
@@ -668,32 +779,701 @@
           </wp:inline>
         </w:drawing>
       </w:r>
-    </w:p>
-    <w:p>
-      <w:r>
-        <w:t xml:space="preserve">According to this reaction, I understood that the </w:t>
-      </w:r>
-      <w:r>
-        <w:t xml:space="preserve">server </w:t>
-      </w:r>
-      <w:r>
-        <w:t xml:space="preserve">first of all check if the user </w:t>
-      </w:r>
-      <w:r>
-        <w:t>exists</w:t>
-      </w:r>
-      <w:r>
-        <w:t xml:space="preserve"> or not before </w:t>
-      </w:r>
-      <w:r>
-        <w:t>checking the password so I can use it to perform a username bruteforce using this python script that I wrote:</w:t>
-      </w:r>
-    </w:p>
-    <w:p/>
+      <w:r>
+        <w:drawing>
+          <wp:inline distT="0" distB="0" distL="0" distR="0" wp14:anchorId="0AA744CA" wp14:editId="4663BB20">
+            <wp:extent cx="7304403" cy="1969941"/>
+            <wp:effectExtent l="0" t="0" r="0" b="0"/>
+            <wp:docPr id="1101551810" name="תמונה 1" descr="תמונה שמכילה טקסט, צילום מסך, גופן&#10;&#10;תוכן בינה מלאכותית גנרטיבית עשוי להיות שגוי."/>
+            <wp:cNvGraphicFramePr>
+              <a:graphicFrameLocks xmlns:a="http://schemas.openxmlformats.org/drawingml/2006/main" noChangeAspect="1"/>
+            </wp:cNvGraphicFramePr>
+            <a:graphic xmlns:a="http://schemas.openxmlformats.org/drawingml/2006/main">
+              <a:graphicData uri="http://schemas.openxmlformats.org/drawingml/2006/picture">
+                <pic:pic xmlns:pic="http://schemas.openxmlformats.org/drawingml/2006/picture">
+                  <pic:nvPicPr>
+                    <pic:cNvPr id="1101551810" name="תמונה 1" descr="תמונה שמכילה טקסט, צילום מסך, גופן&#10;&#10;תוכן בינה מלאכותית גנרטיבית עשוי להיות שגוי."/>
+                    <pic:cNvPicPr/>
+                  </pic:nvPicPr>
+                  <pic:blipFill>
+                    <a:blip r:embed="rId13"/>
+                    <a:stretch>
+                      <a:fillRect/>
+                    </a:stretch>
+                  </pic:blipFill>
+                  <pic:spPr>
+                    <a:xfrm>
+                      <a:off x="0" y="0"/>
+                      <a:ext cx="7304403" cy="1969941"/>
+                    </a:xfrm>
+                    <a:prstGeom prst="rect">
+                      <a:avLst/>
+                    </a:prstGeom>
+                  </pic:spPr>
+                </pic:pic>
+              </a:graphicData>
+            </a:graphic>
+          </wp:inline>
+        </w:drawing>
+      </w:r>
+    </w:p>
+    <w:p>
+      <w:r>
+        <w:t xml:space="preserve">Here I found a </w:t>
+      </w:r>
+      <w:r>
+        <w:t>plugin named “jsmol2wp”.</w:t>
+      </w:r>
+      <w:r>
+        <w:t xml:space="preserve"> This plugin </w:t>
+      </w:r>
+      <w:r>
+        <w:t>version is 1.07 which means it</w:t>
+      </w:r>
+      <w:r>
+        <w:t>’s</w:t>
+      </w:r>
+      <w:r>
+        <w:t xml:space="preserve"> vulnerable to</w:t>
+      </w:r>
+      <w:r>
+        <w:t xml:space="preserve"> the specific</w:t>
+      </w:r>
+      <w:r>
+        <w:t xml:space="preserve"> </w:t>
+      </w:r>
+      <w:r>
+        <w:t xml:space="preserve">unauthenticated </w:t>
+      </w:r>
+      <w:r>
+        <w:t>SSRF</w:t>
+      </w:r>
+      <w:r>
+        <w:t xml:space="preserve"> vulnerability</w:t>
+      </w:r>
+      <w:r>
+        <w:t xml:space="preserve"> “</w:t>
+      </w:r>
+      <w:r>
+        <w:t>CVE-2018-20463</w:t>
+      </w:r>
+      <w:r>
+        <w:t>”</w:t>
+      </w:r>
+      <w:r>
+        <w:t xml:space="preserve"> (</w:t>
+      </w:r>
+      <w:r>
+        <w:t>a vulnerability where an attacker, without needing login credentials, tricks a web application's server into making unauthorized requests to internal or external resources, potentially exposing sensitive data or enabling further attacks</w:t>
+      </w:r>
+      <w:r>
+        <w:t>)</w:t>
+      </w:r>
+      <w:r>
+        <w:t xml:space="preserve">. </w:t>
+      </w:r>
+    </w:p>
+    <w:p>
+      <w:r>
+        <w:t>The vulnerability originally from a</w:t>
+      </w:r>
+      <w:r>
+        <w:t xml:space="preserve"> </w:t>
+      </w:r>
+      <w:r>
+        <w:t>file that located on “</w:t>
+      </w:r>
+      <w:r>
+        <w:t>/wp-content/plugins/jsmol2wp/php/jsmol.php</w:t>
+      </w:r>
+      <w:r>
+        <w:t xml:space="preserve">” </w:t>
+      </w:r>
+      <w:r>
+        <w:t xml:space="preserve">that </w:t>
+      </w:r>
+      <w:r>
+        <w:t xml:space="preserve">gets </w:t>
+      </w:r>
+      <w:r>
+        <w:t>several parameters like “</w:t>
+      </w:r>
+      <w:r>
+        <w:t>inform</w:t>
+      </w:r>
+      <w:r>
+        <w:t>”</w:t>
+      </w:r>
+      <w:r>
+        <w:t xml:space="preserve">, </w:t>
+      </w:r>
+      <w:r>
+        <w:t>“</w:t>
+      </w:r>
+      <w:r>
+        <w:t>call</w:t>
+      </w:r>
+      <w:r>
+        <w:t>”</w:t>
+      </w:r>
+      <w:r>
+        <w:t xml:space="preserve">, </w:t>
+      </w:r>
+      <w:r>
+        <w:t>“</w:t>
+      </w:r>
+      <w:r>
+        <w:t>query</w:t>
+      </w:r>
+      <w:r>
+        <w:t>”</w:t>
+      </w:r>
+      <w:r>
+        <w:t xml:space="preserve"> and more</w:t>
+      </w:r>
+      <w:r>
+        <w:t>…</w:t>
+      </w:r>
+      <w:r>
+        <w:t xml:space="preserve"> from the url</w:t>
+      </w:r>
+      <w:r>
+        <w:t xml:space="preserve"> and </w:t>
+      </w:r>
+      <w:r>
+        <w:t xml:space="preserve">use their values </w:t>
+      </w:r>
+      <w:r>
+        <w:t xml:space="preserve">without </w:t>
+      </w:r>
+      <w:r>
+        <w:t>sensitiz</w:t>
+      </w:r>
+      <w:r>
+        <w:t>ing</w:t>
+      </w:r>
+      <w:r>
+        <w:t xml:space="preserve"> them</w:t>
+      </w:r>
+      <w:r>
+        <w:t>.</w:t>
+      </w:r>
+    </w:p>
+    <w:p>
+      <w:r>
+        <w:t xml:space="preserve">Therefore, I wrote this </w:t>
+      </w:r>
+      <w:r>
+        <w:t>url</w:t>
+      </w:r>
+      <w:r>
+        <w:t xml:space="preserve"> as </w:t>
+      </w:r>
+      <w:r>
+        <w:t>an LFI</w:t>
+      </w:r>
+      <w:r>
+        <w:t xml:space="preserve"> (Local File Inclusion)</w:t>
+      </w:r>
+      <w:r>
+        <w:t xml:space="preserve"> exploit</w:t>
+      </w:r>
+      <w:r>
+        <w:t>:</w:t>
+      </w:r>
+    </w:p>
+    <w:p>
+      <w:hyperlink r:id="rId14" w:history="1">
+        <w:r>
+          <w:rPr>
+            <w:rStyle w:val="Hyperlink"/>
+          </w:rPr>
+          <w:t>http://www.smol.thm/wp-content/plugins/jsmol2wp/php/jsmol.php?isform=true&amp;call=getRawDataFromDatabase&amp;query=php://filter/resource=../../../../wp-config.php</w:t>
+        </w:r>
+      </w:hyperlink>
+    </w:p>
+    <w:p>
+      <w:r>
+        <w:t xml:space="preserve">In short, it basically </w:t>
+      </w:r>
+      <w:r>
+        <w:t>creates an internal php request</w:t>
+      </w:r>
+      <w:r>
+        <w:t xml:space="preserve"> </w:t>
+      </w:r>
+      <w:r>
+        <w:t xml:space="preserve">to the file “wp-config.php” </w:t>
+      </w:r>
+      <w:r>
+        <w:t xml:space="preserve">by </w:t>
+      </w:r>
+      <w:r>
+        <w:t>path traversal</w:t>
+      </w:r>
+      <w:r>
+        <w:t xml:space="preserve"> (I know the location of “jsmol.php” because I found the source code of the jsmol2wp in github)</w:t>
+      </w:r>
+    </w:p>
     <w:p>
       <w:r>
         <w:lastRenderedPageBreak/>
+        <w:drawing>
+          <wp:inline distT="0" distB="0" distL="0" distR="0" wp14:anchorId="04979771" wp14:editId="1AE4439F">
+            <wp:extent cx="7556500" cy="3386455"/>
+            <wp:effectExtent l="0" t="0" r="6350" b="4445"/>
+            <wp:docPr id="11498283" name="תמונה 1"/>
+            <wp:cNvGraphicFramePr>
+              <a:graphicFrameLocks xmlns:a="http://schemas.openxmlformats.org/drawingml/2006/main" noChangeAspect="1"/>
+            </wp:cNvGraphicFramePr>
+            <a:graphic xmlns:a="http://schemas.openxmlformats.org/drawingml/2006/main">
+              <a:graphicData uri="http://schemas.openxmlformats.org/drawingml/2006/picture">
+                <pic:pic xmlns:pic="http://schemas.openxmlformats.org/drawingml/2006/picture">
+                  <pic:nvPicPr>
+                    <pic:cNvPr id="11498283" name=""/>
+                    <pic:cNvPicPr/>
+                  </pic:nvPicPr>
+                  <pic:blipFill>
+                    <a:blip r:embed="rId15"/>
+                    <a:stretch>
+                      <a:fillRect/>
+                    </a:stretch>
+                  </pic:blipFill>
+                  <pic:spPr>
+                    <a:xfrm>
+                      <a:off x="0" y="0"/>
+                      <a:ext cx="7556500" cy="3386455"/>
+                    </a:xfrm>
+                    <a:prstGeom prst="rect">
+                      <a:avLst/>
+                    </a:prstGeom>
+                  </pic:spPr>
+                </pic:pic>
+              </a:graphicData>
+            </a:graphic>
+          </wp:inline>
+        </w:drawing>
+      </w:r>
+    </w:p>
+    <w:p>
+      <w:r>
+        <w:t>I</w:t>
+      </w:r>
+      <w:r>
+        <w:t xml:space="preserve"> chose this specific file on purpose because it </w:t>
+      </w:r>
+      <w:r>
+        <w:t>contain</w:t>
+      </w:r>
+      <w:r>
+        <w:t>s</w:t>
+      </w:r>
+      <w:r>
+        <w:t xml:space="preserve"> a lot of useful</w:t>
+      </w:r>
+      <w:r>
+        <w:t xml:space="preserve"> data.</w:t>
+      </w:r>
+    </w:p>
+    <w:p>
+      <w:r>
+        <w:t xml:space="preserve">After reading the </w:t>
+      </w:r>
+      <w:r>
+        <w:t>database settings,</w:t>
+      </w:r>
+      <w:r>
+        <w:t xml:space="preserve"> I </w:t>
+      </w:r>
+      <w:r>
+        <w:t xml:space="preserve">saw in the database settings, the database user credentials so I tried to use it on the login </w:t>
+      </w:r>
+      <w:r>
+        <w:t>page,</w:t>
+      </w:r>
+      <w:r>
+        <w:t xml:space="preserve"> and it worked!</w:t>
+      </w:r>
+    </w:p>
+    <w:p>
+      <w:r>
+        <w:drawing>
+          <wp:inline distT="0" distB="0" distL="0" distR="0" wp14:anchorId="5F6CD646" wp14:editId="6D652BF8">
+            <wp:extent cx="2865368" cy="3867485"/>
+            <wp:effectExtent l="0" t="0" r="0" b="0"/>
+            <wp:docPr id="65907904" name="תמונה 1"/>
+            <wp:cNvGraphicFramePr>
+              <a:graphicFrameLocks xmlns:a="http://schemas.openxmlformats.org/drawingml/2006/main" noChangeAspect="1"/>
+            </wp:cNvGraphicFramePr>
+            <a:graphic xmlns:a="http://schemas.openxmlformats.org/drawingml/2006/main">
+              <a:graphicData uri="http://schemas.openxmlformats.org/drawingml/2006/picture">
+                <pic:pic xmlns:pic="http://schemas.openxmlformats.org/drawingml/2006/picture">
+                  <pic:nvPicPr>
+                    <pic:cNvPr id="65907904" name=""/>
+                    <pic:cNvPicPr/>
+                  </pic:nvPicPr>
+                  <pic:blipFill>
+                    <a:blip r:embed="rId16"/>
+                    <a:stretch>
+                      <a:fillRect/>
+                    </a:stretch>
+                  </pic:blipFill>
+                  <pic:spPr>
+                    <a:xfrm>
+                      <a:off x="0" y="0"/>
+                      <a:ext cx="2865368" cy="3867485"/>
+                    </a:xfrm>
+                    <a:prstGeom prst="rect">
+                      <a:avLst/>
+                    </a:prstGeom>
+                  </pic:spPr>
+                </pic:pic>
+              </a:graphicData>
+            </a:graphic>
+          </wp:inline>
+        </w:drawing>
+      </w:r>
+    </w:p>
+    <w:p>
+      <w:r>
+        <w:t>And I got into the dashboard:</w:t>
+      </w:r>
+    </w:p>
+    <w:p>
+      <w:r>
+        <w:lastRenderedPageBreak/>
+        <w:drawing>
+          <wp:inline distT="0" distB="0" distL="0" distR="0" wp14:anchorId="790CA1D5" wp14:editId="74A959F8">
+            <wp:extent cx="7304403" cy="5601185"/>
+            <wp:effectExtent l="0" t="0" r="0" b="0"/>
+            <wp:docPr id="2086253301" name="תמונה 1"/>
+            <wp:cNvGraphicFramePr>
+              <a:graphicFrameLocks xmlns:a="http://schemas.openxmlformats.org/drawingml/2006/main" noChangeAspect="1"/>
+            </wp:cNvGraphicFramePr>
+            <a:graphic xmlns:a="http://schemas.openxmlformats.org/drawingml/2006/main">
+              <a:graphicData uri="http://schemas.openxmlformats.org/drawingml/2006/picture">
+                <pic:pic xmlns:pic="http://schemas.openxmlformats.org/drawingml/2006/picture">
+                  <pic:nvPicPr>
+                    <pic:cNvPr id="2086253301" name=""/>
+                    <pic:cNvPicPr/>
+                  </pic:nvPicPr>
+                  <pic:blipFill>
+                    <a:blip r:embed="rId17"/>
+                    <a:stretch>
+                      <a:fillRect/>
+                    </a:stretch>
+                  </pic:blipFill>
+                  <pic:spPr>
+                    <a:xfrm>
+                      <a:off x="0" y="0"/>
+                      <a:ext cx="7304403" cy="5601185"/>
+                    </a:xfrm>
+                    <a:prstGeom prst="rect">
+                      <a:avLst/>
+                    </a:prstGeom>
+                  </pic:spPr>
+                </pic:pic>
+              </a:graphicData>
+            </a:graphic>
+          </wp:inline>
+        </w:drawing>
+      </w:r>
+    </w:p>
+    <w:p>
+      <w:r>
+        <w:t xml:space="preserve">Here I </w:t>
+      </w:r>
+      <w:r>
+        <w:t>went to the “Pages” section and found there a new page:</w:t>
+      </w:r>
+    </w:p>
+    <w:p>
+      <w:r>
+        <w:drawing>
+          <wp:inline distT="0" distB="0" distL="0" distR="0" wp14:anchorId="713C594C" wp14:editId="333A9A3E">
+            <wp:extent cx="7334886" cy="3467400"/>
+            <wp:effectExtent l="0" t="0" r="0" b="0"/>
+            <wp:docPr id="620521046" name="תמונה 1"/>
+            <wp:cNvGraphicFramePr>
+              <a:graphicFrameLocks xmlns:a="http://schemas.openxmlformats.org/drawingml/2006/main" noChangeAspect="1"/>
+            </wp:cNvGraphicFramePr>
+            <a:graphic xmlns:a="http://schemas.openxmlformats.org/drawingml/2006/main">
+              <a:graphicData uri="http://schemas.openxmlformats.org/drawingml/2006/picture">
+                <pic:pic xmlns:pic="http://schemas.openxmlformats.org/drawingml/2006/picture">
+                  <pic:nvPicPr>
+                    <pic:cNvPr id="620521046" name=""/>
+                    <pic:cNvPicPr/>
+                  </pic:nvPicPr>
+                  <pic:blipFill>
+                    <a:blip r:embed="rId18"/>
+                    <a:stretch>
+                      <a:fillRect/>
+                    </a:stretch>
+                  </pic:blipFill>
+                  <pic:spPr>
+                    <a:xfrm>
+                      <a:off x="0" y="0"/>
+                      <a:ext cx="7334886" cy="3467400"/>
+                    </a:xfrm>
+                    <a:prstGeom prst="rect">
+                      <a:avLst/>
+                    </a:prstGeom>
+                  </pic:spPr>
+                </pic:pic>
+              </a:graphicData>
+            </a:graphic>
+          </wp:inline>
+        </w:drawing>
+      </w:r>
+    </w:p>
+    <w:p>
+      <w:r>
+        <w:t>I open this page and read its content:</w:t>
+      </w:r>
+    </w:p>
+    <w:p>
+      <w:r>
+        <w:lastRenderedPageBreak/>
+        <w:drawing>
+          <wp:inline distT="0" distB="0" distL="0" distR="0" wp14:anchorId="42841AAE" wp14:editId="61006112">
+            <wp:extent cx="7304403" cy="5906012"/>
+            <wp:effectExtent l="0" t="0" r="0" b="0"/>
+            <wp:docPr id="1044293275" name="תמונה 1"/>
+            <wp:cNvGraphicFramePr>
+              <a:graphicFrameLocks xmlns:a="http://schemas.openxmlformats.org/drawingml/2006/main" noChangeAspect="1"/>
+            </wp:cNvGraphicFramePr>
+            <a:graphic xmlns:a="http://schemas.openxmlformats.org/drawingml/2006/main">
+              <a:graphicData uri="http://schemas.openxmlformats.org/drawingml/2006/picture">
+                <pic:pic xmlns:pic="http://schemas.openxmlformats.org/drawingml/2006/picture">
+                  <pic:nvPicPr>
+                    <pic:cNvPr id="1044293275" name=""/>
+                    <pic:cNvPicPr/>
+                  </pic:nvPicPr>
+                  <pic:blipFill>
+                    <a:blip r:embed="rId19"/>
+                    <a:stretch>
+                      <a:fillRect/>
+                    </a:stretch>
+                  </pic:blipFill>
+                  <pic:spPr>
+                    <a:xfrm>
+                      <a:off x="0" y="0"/>
+                      <a:ext cx="7304403" cy="5906012"/>
+                    </a:xfrm>
+                    <a:prstGeom prst="rect">
+                      <a:avLst/>
+                    </a:prstGeom>
+                  </pic:spPr>
+                </pic:pic>
+              </a:graphicData>
+            </a:graphic>
+          </wp:inline>
+        </w:drawing>
+      </w:r>
+    </w:p>
+    <w:p>
+      <w:r>
+        <w:t xml:space="preserve">From the first line, I understood that there is </w:t>
+      </w:r>
+      <w:r>
+        <w:t xml:space="preserve">backdoor in </w:t>
+      </w:r>
+      <w:r>
+        <w:t>source code of the “Hello Dolly” plugin</w:t>
+      </w:r>
+      <w:r>
+        <w:t xml:space="preserve"> so I searched it</w:t>
+      </w:r>
+      <w:r>
         <w:t xml:space="preserve"> </w:t>
+      </w:r>
+      <w:r>
+        <w:t>(I know the location of “</w:t>
+      </w:r>
+      <w:r>
+        <w:t>hello</w:t>
+      </w:r>
+      <w:r>
+        <w:t>.php” because I found the source code of the jsmol2wp in github)</w:t>
+      </w:r>
+      <w:r>
+        <w:t>:</w:t>
+      </w:r>
+    </w:p>
+    <w:p>
+      <w:hyperlink r:id="rId20" w:history="1">
+        <w:r>
+          <w:rPr>
+            <w:rStyle w:val="Hyperlink"/>
+          </w:rPr>
+          <w:t>http://www.smol.thm/wp-content/plugins/jsmol2wp/php/jsmol.php?isform=true&amp;call=getRawDataFromDatabase&amp;query=php://filter/resource=../../../../wp-content/plugins/hello.php</w:t>
+        </w:r>
+      </w:hyperlink>
+    </w:p>
+    <w:p>
+      <w:r>
+        <w:t xml:space="preserve">And this is </w:t>
+      </w:r>
+      <w:r>
+        <w:t>the file:</w:t>
+      </w:r>
+    </w:p>
+    <w:p>
+      <w:r>
+        <w:lastRenderedPageBreak/>
+        <w:drawing>
+          <wp:inline distT="0" distB="0" distL="0" distR="0" wp14:anchorId="5B9BBF9A" wp14:editId="01126BD6">
+            <wp:extent cx="7296782" cy="5265876"/>
+            <wp:effectExtent l="0" t="0" r="0" b="0"/>
+            <wp:docPr id="1170048813" name="תמונה 1"/>
+            <wp:cNvGraphicFramePr>
+              <a:graphicFrameLocks xmlns:a="http://schemas.openxmlformats.org/drawingml/2006/main" noChangeAspect="1"/>
+            </wp:cNvGraphicFramePr>
+            <a:graphic xmlns:a="http://schemas.openxmlformats.org/drawingml/2006/main">
+              <a:graphicData uri="http://schemas.openxmlformats.org/drawingml/2006/picture">
+                <pic:pic xmlns:pic="http://schemas.openxmlformats.org/drawingml/2006/picture">
+                  <pic:nvPicPr>
+                    <pic:cNvPr id="1170048813" name=""/>
+                    <pic:cNvPicPr/>
+                  </pic:nvPicPr>
+                  <pic:blipFill>
+                    <a:blip r:embed="rId21"/>
+                    <a:stretch>
+                      <a:fillRect/>
+                    </a:stretch>
+                  </pic:blipFill>
+                  <pic:spPr>
+                    <a:xfrm>
+                      <a:off x="0" y="0"/>
+                      <a:ext cx="7296782" cy="5265876"/>
+                    </a:xfrm>
+                    <a:prstGeom prst="rect">
+                      <a:avLst/>
+                    </a:prstGeom>
+                  </pic:spPr>
+                </pic:pic>
+              </a:graphicData>
+            </a:graphic>
+          </wp:inline>
+        </w:drawing>
+      </w:r>
+    </w:p>
+    <w:p>
+      <w:r>
+        <w:t>While reading the file’s content, I encountered</w:t>
+      </w:r>
+      <w:r>
+        <w:t xml:space="preserve"> with this</w:t>
+      </w:r>
+      <w:r>
+        <w:t xml:space="preserve"> encrypted text:</w:t>
+      </w:r>
+    </w:p>
+    <w:p>
+      <w:r>
+        <w:drawing>
+          <wp:inline distT="0" distB="0" distL="0" distR="0" wp14:anchorId="328F3AA8" wp14:editId="3BCA0564">
+            <wp:extent cx="5867908" cy="1562235"/>
+            <wp:effectExtent l="0" t="0" r="0" b="0"/>
+            <wp:docPr id="403806237" name="תמונה 1"/>
+            <wp:cNvGraphicFramePr>
+              <a:graphicFrameLocks xmlns:a="http://schemas.openxmlformats.org/drawingml/2006/main" noChangeAspect="1"/>
+            </wp:cNvGraphicFramePr>
+            <a:graphic xmlns:a="http://schemas.openxmlformats.org/drawingml/2006/main">
+              <a:graphicData uri="http://schemas.openxmlformats.org/drawingml/2006/picture">
+                <pic:pic xmlns:pic="http://schemas.openxmlformats.org/drawingml/2006/picture">
+                  <pic:nvPicPr>
+                    <pic:cNvPr id="403806237" name=""/>
+                    <pic:cNvPicPr/>
+                  </pic:nvPicPr>
+                  <pic:blipFill>
+                    <a:blip r:embed="rId22"/>
+                    <a:stretch>
+                      <a:fillRect/>
+                    </a:stretch>
+                  </pic:blipFill>
+                  <pic:spPr>
+                    <a:xfrm>
+                      <a:off x="0" y="0"/>
+                      <a:ext cx="5867908" cy="1562235"/>
+                    </a:xfrm>
+                    <a:prstGeom prst="rect">
+                      <a:avLst/>
+                    </a:prstGeom>
+                  </pic:spPr>
+                </pic:pic>
+              </a:graphicData>
+            </a:graphic>
+          </wp:inline>
+        </w:drawing>
+      </w:r>
+    </w:p>
+    <w:p>
+      <w:r>
+        <w:t>It</w:t>
+      </w:r>
+      <w:r>
+        <w:t xml:space="preserve"> seems like a </w:t>
+      </w:r>
+      <w:r>
+        <w:t xml:space="preserve">base64 </w:t>
+      </w:r>
+      <w:r>
+        <w:t>encryption,</w:t>
+      </w:r>
+      <w:r>
+        <w:t xml:space="preserve"> so I decrypted it using base64 and this in the decrypted text:</w:t>
+      </w:r>
+    </w:p>
+    <w:p>
+      <w:r>
+        <w:lastRenderedPageBreak/>
+        <w:drawing>
+          <wp:inline distT="0" distB="0" distL="0" distR="0" wp14:anchorId="6A6431A3" wp14:editId="63B8E6EE">
+            <wp:extent cx="7556500" cy="4224020"/>
+            <wp:effectExtent l="0" t="0" r="6350" b="5080"/>
+            <wp:docPr id="1251991576" name="תמונה 1"/>
+            <wp:cNvGraphicFramePr>
+              <a:graphicFrameLocks xmlns:a="http://schemas.openxmlformats.org/drawingml/2006/main" noChangeAspect="1"/>
+            </wp:cNvGraphicFramePr>
+            <a:graphic xmlns:a="http://schemas.openxmlformats.org/drawingml/2006/main">
+              <a:graphicData uri="http://schemas.openxmlformats.org/drawingml/2006/picture">
+                <pic:pic xmlns:pic="http://schemas.openxmlformats.org/drawingml/2006/picture">
+                  <pic:nvPicPr>
+                    <pic:cNvPr id="1251991576" name=""/>
+                    <pic:cNvPicPr/>
+                  </pic:nvPicPr>
+                  <pic:blipFill>
+                    <a:blip r:embed="rId23"/>
+                    <a:stretch>
+                      <a:fillRect/>
+                    </a:stretch>
+                  </pic:blipFill>
+                  <pic:spPr>
+                    <a:xfrm>
+                      <a:off x="0" y="0"/>
+                      <a:ext cx="7556500" cy="4224020"/>
+                    </a:xfrm>
+                    <a:prstGeom prst="rect">
+                      <a:avLst/>
+                    </a:prstGeom>
+                  </pic:spPr>
+                </pic:pic>
+              </a:graphicData>
+            </a:graphic>
+          </wp:inline>
+        </w:drawing>
+      </w:r>
+    </w:p>
+    <w:p>
+      <w:r>
+        <w:t xml:space="preserve">This is an “if” command </w:t>
+      </w:r>
+      <w:r>
+        <w:t xml:space="preserve">that </w:t>
+      </w:r>
+      <w:r>
+        <w:t>executed after getting decrypted in using the “eval” command.</w:t>
       </w:r>
     </w:p>
     <w:sectPr>
@@ -1310,7 +2090,6 @@
   <w:style w:type="character" w:default="1" w:styleId="a0">
     <w:name w:val="Default Paragraph Font"/>
     <w:uiPriority w:val="1"/>
-    <w:semiHidden/>
     <w:unhideWhenUsed/>
   </w:style>
   <w:style w:type="table" w:default="1" w:styleId="a1">
@@ -1622,6 +2401,29 @@
       <w:smallCaps/>
       <w:color w:val="0F4761" w:themeColor="accent1" w:themeShade="BF"/>
       <w:spacing w:val="5"/>
+    </w:rPr>
+  </w:style>
+  <w:style w:type="character" w:styleId="Hyperlink">
+    <w:name w:val="Hyperlink"/>
+    <w:basedOn w:val="a0"/>
+    <w:uiPriority w:val="99"/>
+    <w:unhideWhenUsed/>
+    <w:rsid w:val="00374DB5"/>
+    <w:rPr>
+      <w:color w:val="467886" w:themeColor="hyperlink"/>
+      <w:u w:val="single"/>
+    </w:rPr>
+  </w:style>
+  <w:style w:type="character" w:styleId="ae">
+    <w:name w:val="Unresolved Mention"/>
+    <w:basedOn w:val="a0"/>
+    <w:uiPriority w:val="99"/>
+    <w:semiHidden/>
+    <w:unhideWhenUsed/>
+    <w:rsid w:val="00374DB5"/>
+    <w:rPr>
+      <w:color w:val="605E5C"/>
+      <w:shd w:val="clear" w:color="auto" w:fill="E1DFDD"/>
     </w:rPr>
   </w:style>
 </w:styles>

</xml_diff>